<commit_message>
Carousel: caption modal, reliable multi-image insert, JPEG fallback
</commit_message>
<xml_diff>
--- a/B-Corridor-News-Guide.docx
+++ b/B-Corridor-News-Guide.docx
@@ -943,7 +943,7 @@
         <w:spacing w:after="60"/>
       </w:pPr>
       <w:r>
-        <w:t>For each photo it asks for an optional caption — type one or leave it blank.</w:t>
+        <w:t>A box opens showing each photo with a caption field underneath. Type a caption for any photo (or leave it blank), then click “Add to article”.</w:t>
       </w:r>
     </w:p>
     <w:p>
@@ -953,6 +953,20 @@
       </w:pPr>
       <w:r>
         <w:t>The gallery appears as a green dashed box in the editor. That's normal — it looks proper on the live site.</w:t>
+      </w:r>
+    </w:p>
+    <w:p>
+      <w:pPr>
+        <w:spacing w:after="160"/>
+        <w:ind w:left="216"/>
+      </w:pPr>
+      <w:r>
+        <w:rPr>
+          <w:i/>
+          <w:color w:val="5A7068"/>
+          <w:sz w:val="21"/>
+        </w:rPr>
+        <w:t>💡  To change a caption later, just click the green carousel box in the editor — the caption box reopens, so you can edit the wording and click “Save captions”. (To add or remove photos, delete the carousel and add it again.)</w:t>
       </w:r>
     </w:p>
     <w:p>

</xml_diff>